<commit_message>
reupload on finalised meeting minutes
</commit_message>
<xml_diff>
--- a/Meeting_Minutes/Week 10_ 11_10.docx
+++ b/Meeting_Minutes/Week 10_ 11_10.docx
@@ -20,7 +20,7 @@
       <w:pPr>
         <w:numPr>
           <w:ilvl w:val="0"/>
-          <w:numId w:val="1"/>
+          <w:numId w:val="2"/>
         </w:numPr>
         <w:ind w:left="720" w:hanging="360"/>
         <w:rPr>
@@ -38,7 +38,7 @@
       <w:pPr>
         <w:numPr>
           <w:ilvl w:val="0"/>
-          <w:numId w:val="1"/>
+          <w:numId w:val="2"/>
         </w:numPr>
         <w:ind w:left="720" w:hanging="360"/>
         <w:rPr>
@@ -70,7 +70,7 @@
       <w:pPr>
         <w:numPr>
           <w:ilvl w:val="0"/>
-          <w:numId w:val="2"/>
+          <w:numId w:val="3"/>
         </w:numPr>
         <w:ind w:left="720" w:hanging="360"/>
         <w:rPr>
@@ -88,7 +88,7 @@
       <w:pPr>
         <w:numPr>
           <w:ilvl w:val="0"/>
-          <w:numId w:val="2"/>
+          <w:numId w:val="3"/>
         </w:numPr>
         <w:ind w:left="720" w:hanging="360"/>
         <w:rPr>
@@ -106,7 +106,7 @@
       <w:pPr>
         <w:numPr>
           <w:ilvl w:val="0"/>
-          <w:numId w:val="2"/>
+          <w:numId w:val="3"/>
         </w:numPr>
         <w:ind w:left="720" w:hanging="360"/>
         <w:rPr>
@@ -124,7 +124,7 @@
       <w:pPr>
         <w:numPr>
           <w:ilvl w:val="0"/>
-          <w:numId w:val="2"/>
+          <w:numId w:val="3"/>
         </w:numPr>
         <w:ind w:left="720" w:hanging="360"/>
         <w:rPr>
@@ -142,7 +142,7 @@
       <w:pPr>
         <w:numPr>
           <w:ilvl w:val="0"/>
-          <w:numId w:val="2"/>
+          <w:numId w:val="3"/>
         </w:numPr>
         <w:ind w:left="720" w:hanging="360"/>
         <w:rPr>
@@ -164,6 +164,95 @@
         <w:rPr>
           <w:rtl w:val="0"/>
         </w:rPr>
+      </w:r>
+    </w:p>
+    <w:p>
+      <w:pPr>
+        <w:rPr/>
+      </w:pPr>
+      <w:r>
+        <w:rPr>
+          <w:rtl w:val="0"/>
+        </w:rPr>
+        <w:t xml:space="preserve">Progress:</w:t>
+      </w:r>
+    </w:p>
+    <w:p>
+      <w:pPr>
+        <w:numPr>
+          <w:ilvl w:val="0"/>
+          <w:numId w:val="1"/>
+        </w:numPr>
+        <w:ind w:left="720" w:hanging="360"/>
+        <w:rPr>
+          <w:u w:val="none"/>
+        </w:rPr>
+      </w:pPr>
+      <w:r>
+        <w:rPr>
+          <w:rtl w:val="0"/>
+        </w:rPr>
+        <w:t xml:space="preserve">Bianca: added to Design Process Overview and poster</w:t>
+      </w:r>
+    </w:p>
+    <w:p>
+      <w:pPr>
+        <w:numPr>
+          <w:ilvl w:val="0"/>
+          <w:numId w:val="1"/>
+        </w:numPr>
+        <w:ind w:left="720" w:hanging="360"/>
+      </w:pPr>
+      <w:r>
+        <w:rPr>
+          <w:rtl w:val="0"/>
+        </w:rPr>
+        <w:t xml:space="preserve">Ruby: Finalised Design Process Overview and poster</w:t>
+      </w:r>
+    </w:p>
+    <w:p>
+      <w:pPr>
+        <w:numPr>
+          <w:ilvl w:val="0"/>
+          <w:numId w:val="1"/>
+        </w:numPr>
+        <w:ind w:left="720" w:hanging="360"/>
+      </w:pPr>
+      <w:r>
+        <w:rPr>
+          <w:rtl w:val="0"/>
+        </w:rPr>
+        <w:t xml:space="preserve">Emily: Poster content and design</w:t>
+      </w:r>
+    </w:p>
+    <w:p>
+      <w:pPr>
+        <w:numPr>
+          <w:ilvl w:val="0"/>
+          <w:numId w:val="1"/>
+        </w:numPr>
+        <w:ind w:left="720" w:hanging="360"/>
+      </w:pPr>
+      <w:r>
+        <w:rPr>
+          <w:rtl w:val="0"/>
+        </w:rPr>
+        <w:t xml:space="preserve">Reyana: poster elements</w:t>
+      </w:r>
+    </w:p>
+    <w:p>
+      <w:pPr>
+        <w:numPr>
+          <w:ilvl w:val="0"/>
+          <w:numId w:val="1"/>
+        </w:numPr>
+        <w:ind w:left="720" w:hanging="360"/>
+      </w:pPr>
+      <w:r>
+        <w:rPr>
+          <w:rtl w:val="0"/>
+        </w:rPr>
+        <w:t xml:space="preserve">Ellie: Iterated prototype</w:t>
       </w:r>
     </w:p>
     <w:sectPr>
@@ -181,7 +270,7 @@
     <w:lvl w:ilvl="0">
       <w:start w:val="1"/>
       <w:numFmt w:val="bullet"/>
-      <w:lvlText w:val="●"/>
+      <w:lvlText w:val="-"/>
       <w:lvlJc w:val="left"/>
       <w:pPr>
         <w:ind w:left="720" w:hanging="360"/>
@@ -193,7 +282,7 @@
     <w:lvl w:ilvl="1">
       <w:start w:val="1"/>
       <w:numFmt w:val="bullet"/>
-      <w:lvlText w:val="○"/>
+      <w:lvlText w:val="-"/>
       <w:lvlJc w:val="left"/>
       <w:pPr>
         <w:ind w:left="1440" w:hanging="360"/>
@@ -205,7 +294,7 @@
     <w:lvl w:ilvl="2">
       <w:start w:val="1"/>
       <w:numFmt w:val="bullet"/>
-      <w:lvlText w:val="■"/>
+      <w:lvlText w:val="-"/>
       <w:lvlJc w:val="left"/>
       <w:pPr>
         <w:ind w:left="2160" w:hanging="360"/>
@@ -217,7 +306,7 @@
     <w:lvl w:ilvl="3">
       <w:start w:val="1"/>
       <w:numFmt w:val="bullet"/>
-      <w:lvlText w:val="●"/>
+      <w:lvlText w:val="-"/>
       <w:lvlJc w:val="left"/>
       <w:pPr>
         <w:ind w:left="2880" w:hanging="360"/>
@@ -229,7 +318,7 @@
     <w:lvl w:ilvl="4">
       <w:start w:val="1"/>
       <w:numFmt w:val="bullet"/>
-      <w:lvlText w:val="○"/>
+      <w:lvlText w:val="-"/>
       <w:lvlJc w:val="left"/>
       <w:pPr>
         <w:ind w:left="3600" w:hanging="360"/>
@@ -241,7 +330,7 @@
     <w:lvl w:ilvl="5">
       <w:start w:val="1"/>
       <w:numFmt w:val="bullet"/>
-      <w:lvlText w:val="■"/>
+      <w:lvlText w:val="-"/>
       <w:lvlJc w:val="left"/>
       <w:pPr>
         <w:ind w:left="4320" w:hanging="360"/>
@@ -253,7 +342,7 @@
     <w:lvl w:ilvl="6">
       <w:start w:val="1"/>
       <w:numFmt w:val="bullet"/>
-      <w:lvlText w:val="●"/>
+      <w:lvlText w:val="-"/>
       <w:lvlJc w:val="left"/>
       <w:pPr>
         <w:ind w:left="5040" w:hanging="360"/>
@@ -265,7 +354,7 @@
     <w:lvl w:ilvl="7">
       <w:start w:val="1"/>
       <w:numFmt w:val="bullet"/>
-      <w:lvlText w:val="○"/>
+      <w:lvlText w:val="-"/>
       <w:lvlJc w:val="left"/>
       <w:pPr>
         <w:ind w:left="5760" w:hanging="360"/>
@@ -277,7 +366,7 @@
     <w:lvl w:ilvl="8">
       <w:start w:val="1"/>
       <w:numFmt w:val="bullet"/>
-      <w:lvlText w:val="■"/>
+      <w:lvlText w:val="-"/>
       <w:lvlJc w:val="left"/>
       <w:pPr>
         <w:ind w:left="6480" w:hanging="360"/>
@@ -288,6 +377,116 @@
     </w:lvl>
   </w:abstractNum>
   <w:abstractNum w:abstractNumId="2">
+    <w:lvl w:ilvl="0">
+      <w:start w:val="1"/>
+      <w:numFmt w:val="bullet"/>
+      <w:lvlText w:val="●"/>
+      <w:lvlJc w:val="left"/>
+      <w:pPr>
+        <w:ind w:left="720" w:hanging="360"/>
+      </w:pPr>
+      <w:rPr>
+        <w:u w:val="none"/>
+      </w:rPr>
+    </w:lvl>
+    <w:lvl w:ilvl="1">
+      <w:start w:val="1"/>
+      <w:numFmt w:val="bullet"/>
+      <w:lvlText w:val="○"/>
+      <w:lvlJc w:val="left"/>
+      <w:pPr>
+        <w:ind w:left="1440" w:hanging="360"/>
+      </w:pPr>
+      <w:rPr>
+        <w:u w:val="none"/>
+      </w:rPr>
+    </w:lvl>
+    <w:lvl w:ilvl="2">
+      <w:start w:val="1"/>
+      <w:numFmt w:val="bullet"/>
+      <w:lvlText w:val="■"/>
+      <w:lvlJc w:val="left"/>
+      <w:pPr>
+        <w:ind w:left="2160" w:hanging="360"/>
+      </w:pPr>
+      <w:rPr>
+        <w:u w:val="none"/>
+      </w:rPr>
+    </w:lvl>
+    <w:lvl w:ilvl="3">
+      <w:start w:val="1"/>
+      <w:numFmt w:val="bullet"/>
+      <w:lvlText w:val="●"/>
+      <w:lvlJc w:val="left"/>
+      <w:pPr>
+        <w:ind w:left="2880" w:hanging="360"/>
+      </w:pPr>
+      <w:rPr>
+        <w:u w:val="none"/>
+      </w:rPr>
+    </w:lvl>
+    <w:lvl w:ilvl="4">
+      <w:start w:val="1"/>
+      <w:numFmt w:val="bullet"/>
+      <w:lvlText w:val="○"/>
+      <w:lvlJc w:val="left"/>
+      <w:pPr>
+        <w:ind w:left="3600" w:hanging="360"/>
+      </w:pPr>
+      <w:rPr>
+        <w:u w:val="none"/>
+      </w:rPr>
+    </w:lvl>
+    <w:lvl w:ilvl="5">
+      <w:start w:val="1"/>
+      <w:numFmt w:val="bullet"/>
+      <w:lvlText w:val="■"/>
+      <w:lvlJc w:val="left"/>
+      <w:pPr>
+        <w:ind w:left="4320" w:hanging="360"/>
+      </w:pPr>
+      <w:rPr>
+        <w:u w:val="none"/>
+      </w:rPr>
+    </w:lvl>
+    <w:lvl w:ilvl="6">
+      <w:start w:val="1"/>
+      <w:numFmt w:val="bullet"/>
+      <w:lvlText w:val="●"/>
+      <w:lvlJc w:val="left"/>
+      <w:pPr>
+        <w:ind w:left="5040" w:hanging="360"/>
+      </w:pPr>
+      <w:rPr>
+        <w:u w:val="none"/>
+      </w:rPr>
+    </w:lvl>
+    <w:lvl w:ilvl="7">
+      <w:start w:val="1"/>
+      <w:numFmt w:val="bullet"/>
+      <w:lvlText w:val="○"/>
+      <w:lvlJc w:val="left"/>
+      <w:pPr>
+        <w:ind w:left="5760" w:hanging="360"/>
+      </w:pPr>
+      <w:rPr>
+        <w:u w:val="none"/>
+      </w:rPr>
+    </w:lvl>
+    <w:lvl w:ilvl="8">
+      <w:start w:val="1"/>
+      <w:numFmt w:val="bullet"/>
+      <w:lvlText w:val="■"/>
+      <w:lvlJc w:val="left"/>
+      <w:pPr>
+        <w:ind w:left="6480" w:hanging="360"/>
+      </w:pPr>
+      <w:rPr>
+        <w:u w:val="none"/>
+      </w:rPr>
+    </w:lvl>
+  </w:abstractNum>
+  <w:abstractNum w:abstractNumId="3">
     <w:lvl w:ilvl="0">
       <w:start w:val="1"/>
       <w:numFmt w:val="bullet"/>
@@ -402,6 +601,9 @@
   </w:num>
   <w:num w:numId="2">
     <w:abstractNumId w:val="2"/>
+  </w:num>
+  <w:num w:numId="3">
+    <w:abstractNumId w:val="3"/>
   </w:num>
 </w:numbering>
 </file>

</xml_diff>